<commit_message>
updated the document to include week 1 reflections
</commit_message>
<xml_diff>
--- a/Self Management Review Template/Sam Davies Self Management Reviev Section.docx
+++ b/Self Management Review Template/Sam Davies Self Management Reviev Section.docx
@@ -5,8 +5,13 @@
     <w:sdt>
       <w:sdtPr>
         <w:rPr>
-          <w:rFonts w:ascii="Times New Roman" w:hAnsi="Times New Roman" w:cs="Times New Roman"/>
-          <w:lang w:val="en-GB"/>
+          <w:rFonts w:ascii="Times New Roman" w:eastAsiaTheme="minorHAnsi" w:hAnsi="Times New Roman" w:cs="Times New Roman"/>
+          <w:color w:val="auto"/>
+          <w:kern w:val="2"/>
+          <w:sz w:val="24"/>
+          <w:szCs w:val="24"/>
+          <w:lang w:val="en-GB" w:eastAsia="en-US"/>
+          <w14:ligatures w14:val="standardContextual"/>
         </w:rPr>
         <w:id w:val="2145378052"/>
         <w:docPartObj>
@@ -16,15 +21,8 @@
       </w:sdtPr>
       <w:sdtEndPr>
         <w:rPr>
-          <w:rFonts w:eastAsiaTheme="minorHAnsi"/>
           <w:b/>
           <w:bCs/>
-          <w:color w:val="auto"/>
-          <w:kern w:val="2"/>
-          <w:sz w:val="24"/>
-          <w:szCs w:val="24"/>
-          <w:lang w:eastAsia="en-US"/>
-          <w14:ligatures w14:val="standardContextual"/>
         </w:rPr>
       </w:sdtEndPr>
       <w:sdtContent>
@@ -2458,6 +2456,12 @@
         </w:rPr>
         <w:t xml:space="preserve">I did not get enough hours during this week; however, I believe this is partly due to the fact that the project had not realty kicked off yet and I felt there was not much to do, and I tried to fill that gap by doing as much research as I could without feeling as if I was researching things that were maybe not as useful to the project. </w:t>
       </w:r>
+      <w:r>
+        <w:rPr>
+          <w:rFonts w:ascii="Times New Roman" w:hAnsi="Times New Roman" w:cs="Times New Roman"/>
+        </w:rPr>
+        <w:t>If I could go back to week One and do this project again, I would do my best to get as much research about our topic done as possible.</w:t>
+      </w:r>
     </w:p>
     <w:p>
       <w:pPr>
@@ -2516,19 +2520,7 @@
         <w:rPr>
           <w:rFonts w:ascii="Times New Roman" w:hAnsi="Times New Roman" w:cs="Times New Roman"/>
         </w:rPr>
-        <w:t xml:space="preserve">This discussion relates to the evidence present in appendix Xx – Samuel Davies Week </w:t>
-      </w:r>
-      <w:r>
-        <w:rPr>
-          <w:rFonts w:ascii="Times New Roman" w:hAnsi="Times New Roman" w:cs="Times New Roman"/>
-        </w:rPr>
-        <w:t xml:space="preserve">10 </w:t>
-      </w:r>
-      <w:r>
-        <w:rPr>
-          <w:rFonts w:ascii="Times New Roman" w:hAnsi="Times New Roman" w:cs="Times New Roman"/>
-        </w:rPr>
-        <w:t>Individual Logbook Discussion</w:t>
+        <w:t>This discussion relates to the evidence present in appendix Xx – Samuel Davies Week 10 Individual Logbook Discussion</w:t>
       </w:r>
       <w:r>
         <w:rPr>
@@ -2550,6 +2542,7 @@
         <w:rPr>
           <w:rFonts w:ascii="Times New Roman" w:hAnsi="Times New Roman" w:cs="Times New Roman"/>
         </w:rPr>
+        <w:lastRenderedPageBreak/>
         <w:t>Experience</w:t>
       </w:r>
       <w:bookmarkEnd w:id="5"/>
@@ -2565,14 +2558,7 @@
         <w:rPr>
           <w:rFonts w:ascii="Times New Roman" w:hAnsi="Times New Roman" w:cs="Times New Roman"/>
         </w:rPr>
-        <w:t xml:space="preserve">This week was one of my best weeks as I managed to reach the 30-hour mark for hours completed, this was mainly due to the number of meetings we had this week as well as the </w:t>
-      </w:r>
-      <w:r>
-        <w:rPr>
-          <w:rFonts w:ascii="Times New Roman" w:hAnsi="Times New Roman" w:cs="Times New Roman"/>
-        </w:rPr>
-        <w:lastRenderedPageBreak/>
-        <w:t>work on the reports that I was able to complete this week, these reports were really great and enabled me to reach the goal of 30 hours for the week.</w:t>
+        <w:t>This week was one of my best weeks as I managed to reach the 30-hour mark for hours completed, this was mainly due to the number of meetings we had this week as well as the work on the reports that I was able to complete this week, these reports were really great and enabled me to reach the goal of 30 hours for the week.</w:t>
       </w:r>
       <w:r>
         <w:rPr>
@@ -2727,6 +2713,7 @@
         <w:rPr>
           <w:rFonts w:ascii="Times New Roman" w:hAnsi="Times New Roman" w:cs="Times New Roman"/>
         </w:rPr>
+        <w:lastRenderedPageBreak/>
         <w:t xml:space="preserve">Appendix Xx – </w:t>
       </w:r>
       <w:r>
@@ -2776,6 +2763,7 @@
       <w:r>
         <w:rPr>
           <w:rFonts w:ascii="Times New Roman" w:hAnsi="Times New Roman" w:cs="Times New Roman"/>
+          <w:noProof/>
         </w:rPr>
         <w:drawing>
           <wp:inline distT="0" distB="0" distL="0" distR="0" wp14:anchorId="378A0768" wp14:editId="04E37993">
@@ -2821,23 +2809,22 @@
           <w:rFonts w:ascii="Times New Roman" w:hAnsi="Times New Roman" w:cs="Times New Roman"/>
         </w:rPr>
       </w:pPr>
-      <w:bookmarkStart w:id="9" w:name="_Toc5247"/>
-      <w:bookmarkStart w:id="10" w:name="_Toc241961952"/>
-      <w:r>
-        <w:rPr>
-          <w:rFonts w:ascii="Times New Roman" w:hAnsi="Times New Roman" w:cs="Times New Roman"/>
-        </w:rPr>
-        <w:lastRenderedPageBreak/>
+      <w:bookmarkStart w:id="9" w:name="_Toc241961952"/>
+      <w:bookmarkStart w:id="10" w:name="_Toc5247"/>
+      <w:r>
+        <w:rPr>
+          <w:rFonts w:ascii="Times New Roman" w:hAnsi="Times New Roman" w:cs="Times New Roman"/>
+        </w:rPr>
         <w:t>Learning outcomes</w:t>
       </w:r>
+      <w:bookmarkEnd w:id="9"/>
+      <w:r>
+        <w:rPr>
+          <w:rFonts w:ascii="Times New Roman" w:hAnsi="Times New Roman" w:cs="Times New Roman"/>
+        </w:rPr>
+        <w:t xml:space="preserve">   </w:t>
+      </w:r>
       <w:bookmarkEnd w:id="10"/>
-      <w:r>
-        <w:rPr>
-          <w:rFonts w:ascii="Times New Roman" w:hAnsi="Times New Roman" w:cs="Times New Roman"/>
-        </w:rPr>
-        <w:t xml:space="preserve">   </w:t>
-      </w:r>
-      <w:bookmarkEnd w:id="9"/>
     </w:p>
     <w:p>
       <w:pPr>
@@ -2970,22 +2957,22 @@
           <w:rFonts w:ascii="Times New Roman" w:hAnsi="Times New Roman" w:cs="Times New Roman"/>
         </w:rPr>
       </w:pPr>
-      <w:bookmarkStart w:id="11" w:name="_Toc5248"/>
-      <w:bookmarkStart w:id="12" w:name="_Toc241961953"/>
+      <w:bookmarkStart w:id="11" w:name="_Toc241961953"/>
+      <w:bookmarkStart w:id="12" w:name="_Toc5248"/>
       <w:r>
         <w:rPr>
           <w:rFonts w:ascii="Times New Roman" w:hAnsi="Times New Roman" w:cs="Times New Roman"/>
         </w:rPr>
         <w:t>General notes</w:t>
       </w:r>
+      <w:bookmarkEnd w:id="11"/>
+      <w:r>
+        <w:rPr>
+          <w:rFonts w:ascii="Times New Roman" w:hAnsi="Times New Roman" w:cs="Times New Roman"/>
+        </w:rPr>
+        <w:t xml:space="preserve">   </w:t>
+      </w:r>
       <w:bookmarkEnd w:id="12"/>
-      <w:r>
-        <w:rPr>
-          <w:rFonts w:ascii="Times New Roman" w:hAnsi="Times New Roman" w:cs="Times New Roman"/>
-        </w:rPr>
-        <w:t xml:space="preserve">   </w:t>
-      </w:r>
-      <w:bookmarkEnd w:id="11"/>
     </w:p>
     <w:p>
       <w:pPr>
@@ -3042,6 +3029,7 @@
         <w:rPr>
           <w:rFonts w:ascii="Times New Roman" w:hAnsi="Times New Roman" w:cs="Times New Roman"/>
         </w:rPr>
+        <w:lastRenderedPageBreak/>
         <w:t xml:space="preserve">Your logbook needs:  A Cover page  </w:t>
       </w:r>
     </w:p>
@@ -3214,7 +3202,6 @@
         <w:rPr>
           <w:rFonts w:ascii="Times New Roman" w:hAnsi="Times New Roman" w:cs="Times New Roman"/>
         </w:rPr>
-        <w:lastRenderedPageBreak/>
         <w:t xml:space="preserve">Also note, hours can be rejected if they are not accurate or clear. </w:t>
       </w:r>
     </w:p>
@@ -3460,6 +3447,7 @@
         <w:rPr>
           <w:rFonts w:ascii="Times New Roman" w:hAnsi="Times New Roman" w:cs="Times New Roman"/>
         </w:rPr>
+        <w:lastRenderedPageBreak/>
         <w:t>Hours Breakdown</w:t>
       </w:r>
       <w:bookmarkEnd w:id="13"/>
@@ -4039,7 +4027,6 @@
               <w:rPr>
                 <w:rFonts w:ascii="Times New Roman" w:hAnsi="Times New Roman" w:cs="Times New Roman"/>
               </w:rPr>
-              <w:lastRenderedPageBreak/>
               <w:t>Sick leave/specific conditions</w:t>
             </w:r>
           </w:p>
@@ -4341,22 +4328,23 @@
           <w:rFonts w:ascii="Times New Roman" w:hAnsi="Times New Roman" w:cs="Times New Roman"/>
         </w:rPr>
       </w:pPr>
-      <w:bookmarkStart w:id="14" w:name="_Toc5250"/>
-      <w:bookmarkStart w:id="15" w:name="_Toc241961955"/>
-      <w:r>
-        <w:rPr>
-          <w:rFonts w:ascii="Times New Roman" w:hAnsi="Times New Roman" w:cs="Times New Roman"/>
-        </w:rPr>
+      <w:bookmarkStart w:id="14" w:name="_Toc241961955"/>
+      <w:bookmarkStart w:id="15" w:name="_Toc5250"/>
+      <w:r>
+        <w:rPr>
+          <w:rFonts w:ascii="Times New Roman" w:hAnsi="Times New Roman" w:cs="Times New Roman"/>
+        </w:rPr>
+        <w:lastRenderedPageBreak/>
         <w:t>Logbook content notes</w:t>
       </w:r>
+      <w:bookmarkEnd w:id="14"/>
+      <w:r>
+        <w:rPr>
+          <w:rFonts w:ascii="Times New Roman" w:hAnsi="Times New Roman" w:cs="Times New Roman"/>
+        </w:rPr>
+        <w:t xml:space="preserve">  </w:t>
+      </w:r>
       <w:bookmarkEnd w:id="15"/>
-      <w:r>
-        <w:rPr>
-          <w:rFonts w:ascii="Times New Roman" w:hAnsi="Times New Roman" w:cs="Times New Roman"/>
-        </w:rPr>
-        <w:t xml:space="preserve">  </w:t>
-      </w:r>
-      <w:bookmarkEnd w:id="14"/>
     </w:p>
     <w:p>
       <w:pPr>
@@ -4504,7 +4492,6 @@
         <w:rPr>
           <w:rFonts w:ascii="Times New Roman" w:hAnsi="Times New Roman" w:cs="Times New Roman"/>
         </w:rPr>
-        <w:lastRenderedPageBreak/>
         <w:t>Research</w:t>
       </w:r>
       <w:bookmarkEnd w:id="19"/>
@@ -4647,6 +4634,7 @@
         <w:rPr>
           <w:rFonts w:ascii="Times New Roman" w:hAnsi="Times New Roman" w:cs="Times New Roman"/>
         </w:rPr>
+        <w:lastRenderedPageBreak/>
         <w:t xml:space="preserve">Appendix Xx </w:t>
       </w:r>
       <w:r>
@@ -4678,6 +4666,7 @@
       <w:r>
         <w:rPr>
           <w:rFonts w:ascii="Times New Roman" w:hAnsi="Times New Roman" w:cs="Times New Roman"/>
+          <w:noProof/>
         </w:rPr>
         <w:drawing>
           <wp:inline distT="0" distB="0" distL="0" distR="0" wp14:anchorId="6C0C19F7" wp14:editId="1EB64A6D">
@@ -4735,7 +4724,6 @@
         <w:rPr>
           <w:rFonts w:ascii="Times New Roman" w:hAnsi="Times New Roman" w:cs="Times New Roman"/>
         </w:rPr>
-        <w:lastRenderedPageBreak/>
         <w:t>Learning outcomes</w:t>
       </w:r>
       <w:bookmarkEnd w:id="24"/>
@@ -4946,6 +4934,7 @@
         <w:rPr>
           <w:rFonts w:ascii="Times New Roman" w:hAnsi="Times New Roman" w:cs="Times New Roman"/>
         </w:rPr>
+        <w:lastRenderedPageBreak/>
         <w:t xml:space="preserve">Your logbook needs:  A Cover page  </w:t>
       </w:r>
     </w:p>
@@ -5118,7 +5107,6 @@
         <w:rPr>
           <w:rFonts w:ascii="Times New Roman" w:hAnsi="Times New Roman" w:cs="Times New Roman"/>
         </w:rPr>
-        <w:lastRenderedPageBreak/>
         <w:t xml:space="preserve">Also note, hours can be rejected if they are not accurate or clear. </w:t>
       </w:r>
     </w:p>
@@ -5364,6 +5352,7 @@
         <w:rPr>
           <w:rFonts w:ascii="Times New Roman" w:hAnsi="Times New Roman" w:cs="Times New Roman"/>
         </w:rPr>
+        <w:lastRenderedPageBreak/>
         <w:t>Hours Breakdown</w:t>
       </w:r>
       <w:bookmarkEnd w:id="26"/>
@@ -5931,7 +5920,6 @@
               <w:rPr>
                 <w:rFonts w:ascii="Times New Roman" w:hAnsi="Times New Roman" w:cs="Times New Roman"/>
               </w:rPr>
-              <w:lastRenderedPageBreak/>
               <w:t>Sick leave/specific conditions</w:t>
             </w:r>
           </w:p>
@@ -6374,7 +6362,6 @@
         <w:rPr>
           <w:rFonts w:ascii="Times New Roman" w:hAnsi="Times New Roman" w:cs="Times New Roman"/>
         </w:rPr>
-        <w:lastRenderedPageBreak/>
         <w:t>Monday – after our meeting with Bryce we had a meeting with clement as per the problem I had with my weekly logs and attempting to sort out a solution, we also talked about the mid project update presentation. 11 – 12pm</w:t>
       </w:r>
     </w:p>

</xml_diff>